<commit_message>
update lAB2, complete FrmSach and FrmDocGia database connection
</commit_message>
<xml_diff>
--- a/LAB2/Lab02_1250080145_LeHoangPhuc.docx
+++ b/LAB2/Lab02_1250080145_LeHoangPhuc.docx
@@ -187,12 +187,18 @@
         <w:keepNext/>
         <w:jc w:val="center"/>
         <w:rPr>
-          <w:lang w:val="vi-VN"/>
-        </w:rPr>
-      </w:pPr>
-      <w:r>
-        <w:rPr>
-          <w:noProof/>
+          <w:rFonts w:ascii="Times New Roman" w:hAnsi="Times New Roman" w:cs="Times New Roman"/>
+          <w:sz w:val="26"/>
+          <w:szCs w:val="26"/>
+          <w:lang w:val="vi-VN"/>
+        </w:rPr>
+      </w:pPr>
+      <w:r>
+        <w:rPr>
+          <w:rFonts w:ascii="Times New Roman" w:hAnsi="Times New Roman" w:cs="Times New Roman"/>
+          <w:noProof/>
+          <w:sz w:val="26"/>
+          <w:szCs w:val="26"/>
         </w:rPr>
         <w:drawing>
           <wp:inline distT="0" distB="0" distL="0" distR="0" wp14:anchorId="03304A59" wp14:editId="4618F9D2">
@@ -248,20 +254,79 @@
       <w:pPr>
         <w:pStyle w:val="Caption"/>
         <w:jc w:val="center"/>
-      </w:pPr>
-      <w:r>
+        <w:rPr>
+          <w:rFonts w:ascii="Times New Roman" w:hAnsi="Times New Roman" w:cs="Times New Roman"/>
+          <w:color w:val="auto"/>
+          <w:sz w:val="26"/>
+          <w:szCs w:val="26"/>
+          <w:lang w:val="vi-VN"/>
+        </w:rPr>
+      </w:pPr>
+      <w:r>
+        <w:rPr>
+          <w:rFonts w:ascii="Times New Roman" w:hAnsi="Times New Roman" w:cs="Times New Roman"/>
+          <w:color w:val="auto"/>
+          <w:sz w:val="26"/>
+          <w:szCs w:val="26"/>
+          <w:lang w:val="vi-VN"/>
+        </w:rPr>
         <w:t xml:space="preserve">Sơ đồ </w:t>
       </w:r>
-      <w:fldSimple w:instr=" SEQ Sơ_đồ \* ARABIC ">
-        <w:r>
-          <w:rPr>
-            <w:noProof/>
-          </w:rPr>
-          <w:t>1</w:t>
-        </w:r>
-      </w:fldSimple>
-      <w:r>
-        <w:rPr>
+      <w:r>
+        <w:rPr>
+          <w:rFonts w:ascii="Times New Roman" w:hAnsi="Times New Roman" w:cs="Times New Roman"/>
+          <w:color w:val="auto"/>
+          <w:sz w:val="26"/>
+          <w:szCs w:val="26"/>
+        </w:rPr>
+        <w:fldChar w:fldCharType="begin"/>
+      </w:r>
+      <w:r>
+        <w:rPr>
+          <w:rFonts w:ascii="Times New Roman" w:hAnsi="Times New Roman" w:cs="Times New Roman"/>
+          <w:color w:val="auto"/>
+          <w:sz w:val="26"/>
+          <w:szCs w:val="26"/>
+          <w:lang w:val="vi-VN"/>
+        </w:rPr>
+        <w:instrText xml:space="preserve"> SEQ Sơ_đồ \* ARABIC </w:instrText>
+      </w:r>
+      <w:r>
+        <w:rPr>
+          <w:rFonts w:ascii="Times New Roman" w:hAnsi="Times New Roman" w:cs="Times New Roman"/>
+          <w:color w:val="auto"/>
+          <w:sz w:val="26"/>
+          <w:szCs w:val="26"/>
+        </w:rPr>
+        <w:fldChar w:fldCharType="separate"/>
+      </w:r>
+      <w:r>
+        <w:rPr>
+          <w:rFonts w:ascii="Times New Roman" w:hAnsi="Times New Roman" w:cs="Times New Roman"/>
+          <w:noProof/>
+          <w:color w:val="auto"/>
+          <w:sz w:val="26"/>
+          <w:szCs w:val="26"/>
+          <w:lang w:val="vi-VN"/>
+        </w:rPr>
+        <w:t>1</w:t>
+      </w:r>
+      <w:r>
+        <w:rPr>
+          <w:rFonts w:ascii="Times New Roman" w:hAnsi="Times New Roman" w:cs="Times New Roman"/>
+          <w:noProof/>
+          <w:color w:val="auto"/>
+          <w:sz w:val="26"/>
+          <w:szCs w:val="26"/>
+        </w:rPr>
+        <w:fldChar w:fldCharType="end"/>
+      </w:r>
+      <w:r>
+        <w:rPr>
+          <w:rFonts w:ascii="Times New Roman" w:hAnsi="Times New Roman" w:cs="Times New Roman"/>
+          <w:color w:val="auto"/>
+          <w:sz w:val="26"/>
+          <w:szCs w:val="26"/>
           <w:lang w:val="vi-VN"/>
         </w:rPr>
         <w:t>. Class Diagram - Hệ thống quản lý thư viện</w:t>
@@ -307,10 +372,18 @@
       <w:pPr>
         <w:keepNext/>
         <w:jc w:val="center"/>
-      </w:pPr>
-      <w:r>
-        <w:rPr>
-          <w:noProof/>
+        <w:rPr>
+          <w:rFonts w:ascii="Times New Roman" w:hAnsi="Times New Roman" w:cs="Times New Roman"/>
+          <w:sz w:val="26"/>
+          <w:szCs w:val="26"/>
+        </w:rPr>
+      </w:pPr>
+      <w:r>
+        <w:rPr>
+          <w:rFonts w:ascii="Times New Roman" w:hAnsi="Times New Roman" w:cs="Times New Roman"/>
+          <w:noProof/>
+          <w:sz w:val="26"/>
+          <w:szCs w:val="26"/>
         </w:rPr>
         <w:drawing>
           <wp:inline distT="0" distB="0" distL="0" distR="0" wp14:anchorId="76D4277C" wp14:editId="33ED88AD">
@@ -366,20 +439,75 @@
       <w:pPr>
         <w:pStyle w:val="Caption"/>
         <w:jc w:val="center"/>
-      </w:pPr>
-      <w:r>
+        <w:rPr>
+          <w:rFonts w:ascii="Times New Roman" w:hAnsi="Times New Roman" w:cs="Times New Roman"/>
+          <w:color w:val="auto"/>
+          <w:sz w:val="26"/>
+          <w:szCs w:val="26"/>
+        </w:rPr>
+      </w:pPr>
+      <w:r>
+        <w:rPr>
+          <w:rFonts w:ascii="Times New Roman" w:hAnsi="Times New Roman" w:cs="Times New Roman"/>
+          <w:color w:val="auto"/>
+          <w:sz w:val="26"/>
+          <w:szCs w:val="26"/>
+        </w:rPr>
         <w:t xml:space="preserve">Sơ đồ </w:t>
       </w:r>
-      <w:fldSimple w:instr=" SEQ Sơ_đồ \* ARABIC ">
-        <w:r>
-          <w:rPr>
-            <w:noProof/>
-          </w:rPr>
-          <w:t>2</w:t>
-        </w:r>
-      </w:fldSimple>
-      <w:r>
-        <w:rPr>
+      <w:r>
+        <w:rPr>
+          <w:rFonts w:ascii="Times New Roman" w:hAnsi="Times New Roman" w:cs="Times New Roman"/>
+          <w:color w:val="auto"/>
+          <w:sz w:val="26"/>
+          <w:szCs w:val="26"/>
+        </w:rPr>
+        <w:fldChar w:fldCharType="begin"/>
+      </w:r>
+      <w:r>
+        <w:rPr>
+          <w:rFonts w:ascii="Times New Roman" w:hAnsi="Times New Roman" w:cs="Times New Roman"/>
+          <w:color w:val="auto"/>
+          <w:sz w:val="26"/>
+          <w:szCs w:val="26"/>
+        </w:rPr>
+        <w:instrText xml:space="preserve"> SEQ Sơ_đồ \* ARABIC </w:instrText>
+      </w:r>
+      <w:r>
+        <w:rPr>
+          <w:rFonts w:ascii="Times New Roman" w:hAnsi="Times New Roman" w:cs="Times New Roman"/>
+          <w:color w:val="auto"/>
+          <w:sz w:val="26"/>
+          <w:szCs w:val="26"/>
+        </w:rPr>
+        <w:fldChar w:fldCharType="separate"/>
+      </w:r>
+      <w:r>
+        <w:rPr>
+          <w:rFonts w:ascii="Times New Roman" w:hAnsi="Times New Roman" w:cs="Times New Roman"/>
+          <w:noProof/>
+          <w:color w:val="auto"/>
+          <w:sz w:val="26"/>
+          <w:szCs w:val="26"/>
+        </w:rPr>
+        <w:t>2</w:t>
+      </w:r>
+      <w:r>
+        <w:rPr>
+          <w:rFonts w:ascii="Times New Roman" w:hAnsi="Times New Roman" w:cs="Times New Roman"/>
+          <w:noProof/>
+          <w:color w:val="auto"/>
+          <w:sz w:val="26"/>
+          <w:szCs w:val="26"/>
+        </w:rPr>
+        <w:fldChar w:fldCharType="end"/>
+      </w:r>
+      <w:r>
+        <w:rPr>
+          <w:rFonts w:ascii="Times New Roman" w:hAnsi="Times New Roman" w:cs="Times New Roman"/>
+          <w:color w:val="auto"/>
+          <w:sz w:val="26"/>
+          <w:szCs w:val="26"/>
           <w:lang w:val="vi-VN"/>
         </w:rPr>
         <w:t>. Activity - Cấp/Gia hạn thẻ</w:t>
@@ -389,7 +517,10 @@
       <w:pPr>
         <w:jc w:val="center"/>
         <w:rPr>
-          <w:noProof/>
+          <w:rFonts w:ascii="Times New Roman" w:hAnsi="Times New Roman" w:cs="Times New Roman"/>
+          <w:noProof/>
+          <w:sz w:val="26"/>
+          <w:szCs w:val="26"/>
           <w:lang w:val="vi-VN"/>
         </w:rPr>
       </w:pPr>
@@ -409,15 +540,23 @@
       <w:pPr>
         <w:keepNext/>
         <w:jc w:val="center"/>
-      </w:pPr>
-      <w:r>
-        <w:rPr>
-          <w:noProof/>
+        <w:rPr>
+          <w:rFonts w:ascii="Times New Roman" w:hAnsi="Times New Roman" w:cs="Times New Roman"/>
+          <w:sz w:val="26"/>
+          <w:szCs w:val="26"/>
+        </w:rPr>
+      </w:pPr>
+      <w:r>
+        <w:rPr>
+          <w:rFonts w:ascii="Times New Roman" w:hAnsi="Times New Roman" w:cs="Times New Roman"/>
+          <w:noProof/>
+          <w:sz w:val="26"/>
+          <w:szCs w:val="26"/>
         </w:rPr>
         <w:lastRenderedPageBreak/>
         <w:drawing>
-          <wp:inline distT="0" distB="0" distL="0" distR="0" wp14:anchorId="40634712" wp14:editId="7FA788B2">
-            <wp:extent cx="6229336" cy="8902700"/>
+          <wp:inline distT="0" distB="0" distL="0" distR="0" wp14:anchorId="40634712" wp14:editId="1DDB3AC4">
+            <wp:extent cx="6228715" cy="8826500"/>
             <wp:effectExtent l="0" t="0" r="635" b="0"/>
             <wp:docPr id="635346877" name="Picture 5"/>
             <wp:cNvGraphicFramePr>
@@ -448,7 +587,7 @@
                   <pic:spPr bwMode="auto">
                     <a:xfrm>
                       <a:off x="0" y="0"/>
-                      <a:ext cx="6238675" cy="8916047"/>
+                      <a:ext cx="6238675" cy="8840614"/>
                     </a:xfrm>
                     <a:prstGeom prst="rect">
                       <a:avLst/>
@@ -473,24 +612,74 @@
           <w:rFonts w:ascii="Times New Roman" w:hAnsi="Times New Roman" w:cs="Times New Roman"/>
           <w:b/>
           <w:bCs/>
-          <w:sz w:val="26"/>
-          <w:szCs w:val="26"/>
-          <w:lang w:val="vi-VN"/>
-        </w:rPr>
-      </w:pPr>
-      <w:r>
+          <w:color w:val="auto"/>
+          <w:sz w:val="26"/>
+          <w:szCs w:val="26"/>
+          <w:lang w:val="vi-VN"/>
+        </w:rPr>
+      </w:pPr>
+      <w:r>
+        <w:rPr>
+          <w:rFonts w:ascii="Times New Roman" w:hAnsi="Times New Roman" w:cs="Times New Roman"/>
+          <w:color w:val="auto"/>
+          <w:sz w:val="26"/>
+          <w:szCs w:val="26"/>
+        </w:rPr>
         <w:t xml:space="preserve">Sơ đồ </w:t>
       </w:r>
-      <w:fldSimple w:instr=" SEQ Sơ_đồ \* ARABIC ">
-        <w:r>
-          <w:rPr>
-            <w:noProof/>
-          </w:rPr>
-          <w:t>3</w:t>
-        </w:r>
-      </w:fldSimple>
-      <w:r>
-        <w:rPr>
+      <w:r>
+        <w:rPr>
+          <w:rFonts w:ascii="Times New Roman" w:hAnsi="Times New Roman" w:cs="Times New Roman"/>
+          <w:color w:val="auto"/>
+          <w:sz w:val="26"/>
+          <w:szCs w:val="26"/>
+        </w:rPr>
+        <w:fldChar w:fldCharType="begin"/>
+      </w:r>
+      <w:r>
+        <w:rPr>
+          <w:rFonts w:ascii="Times New Roman" w:hAnsi="Times New Roman" w:cs="Times New Roman"/>
+          <w:color w:val="auto"/>
+          <w:sz w:val="26"/>
+          <w:szCs w:val="26"/>
+        </w:rPr>
+        <w:instrText xml:space="preserve"> SEQ Sơ_đồ \* ARABIC </w:instrText>
+      </w:r>
+      <w:r>
+        <w:rPr>
+          <w:rFonts w:ascii="Times New Roman" w:hAnsi="Times New Roman" w:cs="Times New Roman"/>
+          <w:color w:val="auto"/>
+          <w:sz w:val="26"/>
+          <w:szCs w:val="26"/>
+        </w:rPr>
+        <w:fldChar w:fldCharType="separate"/>
+      </w:r>
+      <w:r>
+        <w:rPr>
+          <w:rFonts w:ascii="Times New Roman" w:hAnsi="Times New Roman" w:cs="Times New Roman"/>
+          <w:noProof/>
+          <w:color w:val="auto"/>
+          <w:sz w:val="26"/>
+          <w:szCs w:val="26"/>
+        </w:rPr>
+        <w:t>3</w:t>
+      </w:r>
+      <w:r>
+        <w:rPr>
+          <w:rFonts w:ascii="Times New Roman" w:hAnsi="Times New Roman" w:cs="Times New Roman"/>
+          <w:noProof/>
+          <w:color w:val="auto"/>
+          <w:sz w:val="26"/>
+          <w:szCs w:val="26"/>
+        </w:rPr>
+        <w:fldChar w:fldCharType="end"/>
+      </w:r>
+      <w:r>
+        <w:rPr>
+          <w:rFonts w:ascii="Times New Roman" w:hAnsi="Times New Roman" w:cs="Times New Roman"/>
+          <w:color w:val="auto"/>
+          <w:sz w:val="26"/>
+          <w:szCs w:val="26"/>
           <w:lang w:val="vi-VN"/>
         </w:rPr>
         <w:t>. Activity - Mượn sách</w:t>
@@ -500,10 +689,18 @@
       <w:pPr>
         <w:keepNext/>
         <w:jc w:val="center"/>
-      </w:pPr>
-      <w:r>
-        <w:rPr>
-          <w:noProof/>
+        <w:rPr>
+          <w:rFonts w:ascii="Times New Roman" w:hAnsi="Times New Roman" w:cs="Times New Roman"/>
+          <w:sz w:val="26"/>
+          <w:szCs w:val="26"/>
+        </w:rPr>
+      </w:pPr>
+      <w:r>
+        <w:rPr>
+          <w:rFonts w:ascii="Times New Roman" w:hAnsi="Times New Roman" w:cs="Times New Roman"/>
+          <w:noProof/>
+          <w:sz w:val="26"/>
+          <w:szCs w:val="26"/>
         </w:rPr>
         <w:lastRenderedPageBreak/>
         <w:drawing>
@@ -560,20 +757,75 @@
       <w:pPr>
         <w:pStyle w:val="Caption"/>
         <w:jc w:val="center"/>
-      </w:pPr>
-      <w:r>
+        <w:rPr>
+          <w:rFonts w:ascii="Times New Roman" w:hAnsi="Times New Roman" w:cs="Times New Roman"/>
+          <w:color w:val="auto"/>
+          <w:sz w:val="26"/>
+          <w:szCs w:val="26"/>
+        </w:rPr>
+      </w:pPr>
+      <w:r>
+        <w:rPr>
+          <w:rFonts w:ascii="Times New Roman" w:hAnsi="Times New Roman" w:cs="Times New Roman"/>
+          <w:color w:val="auto"/>
+          <w:sz w:val="26"/>
+          <w:szCs w:val="26"/>
+        </w:rPr>
         <w:t xml:space="preserve">Sơ đồ </w:t>
       </w:r>
-      <w:fldSimple w:instr=" SEQ Sơ_đồ \* ARABIC ">
-        <w:r>
-          <w:rPr>
-            <w:noProof/>
-          </w:rPr>
-          <w:t>4</w:t>
-        </w:r>
-      </w:fldSimple>
-      <w:r>
-        <w:rPr>
+      <w:r>
+        <w:rPr>
+          <w:rFonts w:ascii="Times New Roman" w:hAnsi="Times New Roman" w:cs="Times New Roman"/>
+          <w:color w:val="auto"/>
+          <w:sz w:val="26"/>
+          <w:szCs w:val="26"/>
+        </w:rPr>
+        <w:fldChar w:fldCharType="begin"/>
+      </w:r>
+      <w:r>
+        <w:rPr>
+          <w:rFonts w:ascii="Times New Roman" w:hAnsi="Times New Roman" w:cs="Times New Roman"/>
+          <w:color w:val="auto"/>
+          <w:sz w:val="26"/>
+          <w:szCs w:val="26"/>
+        </w:rPr>
+        <w:instrText xml:space="preserve"> SEQ Sơ_đồ \* ARABIC </w:instrText>
+      </w:r>
+      <w:r>
+        <w:rPr>
+          <w:rFonts w:ascii="Times New Roman" w:hAnsi="Times New Roman" w:cs="Times New Roman"/>
+          <w:color w:val="auto"/>
+          <w:sz w:val="26"/>
+          <w:szCs w:val="26"/>
+        </w:rPr>
+        <w:fldChar w:fldCharType="separate"/>
+      </w:r>
+      <w:r>
+        <w:rPr>
+          <w:rFonts w:ascii="Times New Roman" w:hAnsi="Times New Roman" w:cs="Times New Roman"/>
+          <w:noProof/>
+          <w:color w:val="auto"/>
+          <w:sz w:val="26"/>
+          <w:szCs w:val="26"/>
+        </w:rPr>
+        <w:t>4</w:t>
+      </w:r>
+      <w:r>
+        <w:rPr>
+          <w:rFonts w:ascii="Times New Roman" w:hAnsi="Times New Roman" w:cs="Times New Roman"/>
+          <w:noProof/>
+          <w:color w:val="auto"/>
+          <w:sz w:val="26"/>
+          <w:szCs w:val="26"/>
+        </w:rPr>
+        <w:fldChar w:fldCharType="end"/>
+      </w:r>
+      <w:r>
+        <w:rPr>
+          <w:rFonts w:ascii="Times New Roman" w:hAnsi="Times New Roman" w:cs="Times New Roman"/>
+          <w:color w:val="auto"/>
+          <w:sz w:val="26"/>
+          <w:szCs w:val="26"/>
           <w:lang w:val="vi-VN"/>
         </w:rPr>
         <w:t>. Activity - Trả sách và lập phiếu phạt</w:t>
@@ -583,10 +835,18 @@
       <w:pPr>
         <w:keepNext/>
         <w:jc w:val="center"/>
-      </w:pPr>
-      <w:r>
-        <w:rPr>
-          <w:noProof/>
+        <w:rPr>
+          <w:rFonts w:ascii="Times New Roman" w:hAnsi="Times New Roman" w:cs="Times New Roman"/>
+          <w:sz w:val="26"/>
+          <w:szCs w:val="26"/>
+        </w:rPr>
+      </w:pPr>
+      <w:r>
+        <w:rPr>
+          <w:rFonts w:ascii="Times New Roman" w:hAnsi="Times New Roman" w:cs="Times New Roman"/>
+          <w:noProof/>
+          <w:sz w:val="26"/>
+          <w:szCs w:val="26"/>
         </w:rPr>
         <w:lastRenderedPageBreak/>
         <w:drawing>
@@ -643,20 +903,75 @@
       <w:pPr>
         <w:pStyle w:val="Caption"/>
         <w:jc w:val="center"/>
-      </w:pPr>
-      <w:r>
+        <w:rPr>
+          <w:rFonts w:ascii="Times New Roman" w:hAnsi="Times New Roman" w:cs="Times New Roman"/>
+          <w:color w:val="auto"/>
+          <w:sz w:val="26"/>
+          <w:szCs w:val="26"/>
+        </w:rPr>
+      </w:pPr>
+      <w:r>
+        <w:rPr>
+          <w:rFonts w:ascii="Times New Roman" w:hAnsi="Times New Roman" w:cs="Times New Roman"/>
+          <w:color w:val="auto"/>
+          <w:sz w:val="26"/>
+          <w:szCs w:val="26"/>
+        </w:rPr>
         <w:t xml:space="preserve">Sơ đồ </w:t>
       </w:r>
-      <w:fldSimple w:instr=" SEQ Sơ_đồ \* ARABIC ">
-        <w:r>
-          <w:rPr>
-            <w:noProof/>
-          </w:rPr>
-          <w:t>5</w:t>
-        </w:r>
-      </w:fldSimple>
-      <w:r>
-        <w:rPr>
+      <w:r>
+        <w:rPr>
+          <w:rFonts w:ascii="Times New Roman" w:hAnsi="Times New Roman" w:cs="Times New Roman"/>
+          <w:color w:val="auto"/>
+          <w:sz w:val="26"/>
+          <w:szCs w:val="26"/>
+        </w:rPr>
+        <w:fldChar w:fldCharType="begin"/>
+      </w:r>
+      <w:r>
+        <w:rPr>
+          <w:rFonts w:ascii="Times New Roman" w:hAnsi="Times New Roman" w:cs="Times New Roman"/>
+          <w:color w:val="auto"/>
+          <w:sz w:val="26"/>
+          <w:szCs w:val="26"/>
+        </w:rPr>
+        <w:instrText xml:space="preserve"> SEQ Sơ_đồ \* ARABIC </w:instrText>
+      </w:r>
+      <w:r>
+        <w:rPr>
+          <w:rFonts w:ascii="Times New Roman" w:hAnsi="Times New Roman" w:cs="Times New Roman"/>
+          <w:color w:val="auto"/>
+          <w:sz w:val="26"/>
+          <w:szCs w:val="26"/>
+        </w:rPr>
+        <w:fldChar w:fldCharType="separate"/>
+      </w:r>
+      <w:r>
+        <w:rPr>
+          <w:rFonts w:ascii="Times New Roman" w:hAnsi="Times New Roman" w:cs="Times New Roman"/>
+          <w:noProof/>
+          <w:color w:val="auto"/>
+          <w:sz w:val="26"/>
+          <w:szCs w:val="26"/>
+        </w:rPr>
+        <w:t>5</w:t>
+      </w:r>
+      <w:r>
+        <w:rPr>
+          <w:rFonts w:ascii="Times New Roman" w:hAnsi="Times New Roman" w:cs="Times New Roman"/>
+          <w:noProof/>
+          <w:color w:val="auto"/>
+          <w:sz w:val="26"/>
+          <w:szCs w:val="26"/>
+        </w:rPr>
+        <w:fldChar w:fldCharType="end"/>
+      </w:r>
+      <w:r>
+        <w:rPr>
+          <w:rFonts w:ascii="Times New Roman" w:hAnsi="Times New Roman" w:cs="Times New Roman"/>
+          <w:color w:val="auto"/>
+          <w:sz w:val="26"/>
+          <w:szCs w:val="26"/>
           <w:lang w:val="vi-VN"/>
         </w:rPr>
         <w:t>. Activity - Quản lý đầu sách</w:t>
@@ -666,10 +981,18 @@
       <w:pPr>
         <w:keepNext/>
         <w:jc w:val="center"/>
-      </w:pPr>
-      <w:r>
-        <w:rPr>
-          <w:noProof/>
+        <w:rPr>
+          <w:rFonts w:ascii="Times New Roman" w:hAnsi="Times New Roman" w:cs="Times New Roman"/>
+          <w:sz w:val="26"/>
+          <w:szCs w:val="26"/>
+        </w:rPr>
+      </w:pPr>
+      <w:r>
+        <w:rPr>
+          <w:rFonts w:ascii="Times New Roman" w:hAnsi="Times New Roman" w:cs="Times New Roman"/>
+          <w:noProof/>
+          <w:sz w:val="26"/>
+          <w:szCs w:val="26"/>
         </w:rPr>
         <w:lastRenderedPageBreak/>
         <w:drawing>
@@ -730,24 +1053,74 @@
           <w:rFonts w:ascii="Times New Roman" w:hAnsi="Times New Roman" w:cs="Times New Roman"/>
           <w:b/>
           <w:bCs/>
-          <w:sz w:val="26"/>
-          <w:szCs w:val="26"/>
-          <w:lang w:val="vi-VN"/>
-        </w:rPr>
-      </w:pPr>
-      <w:r>
+          <w:color w:val="auto"/>
+          <w:sz w:val="26"/>
+          <w:szCs w:val="26"/>
+          <w:lang w:val="vi-VN"/>
+        </w:rPr>
+      </w:pPr>
+      <w:r>
+        <w:rPr>
+          <w:rFonts w:ascii="Times New Roman" w:hAnsi="Times New Roman" w:cs="Times New Roman"/>
+          <w:color w:val="auto"/>
+          <w:sz w:val="26"/>
+          <w:szCs w:val="26"/>
+        </w:rPr>
         <w:t xml:space="preserve">Sơ đồ </w:t>
       </w:r>
-      <w:fldSimple w:instr=" SEQ Sơ_đồ \* ARABIC ">
-        <w:r>
-          <w:rPr>
-            <w:noProof/>
-          </w:rPr>
-          <w:t>6</w:t>
-        </w:r>
-      </w:fldSimple>
-      <w:r>
-        <w:rPr>
+      <w:r>
+        <w:rPr>
+          <w:rFonts w:ascii="Times New Roman" w:hAnsi="Times New Roman" w:cs="Times New Roman"/>
+          <w:color w:val="auto"/>
+          <w:sz w:val="26"/>
+          <w:szCs w:val="26"/>
+        </w:rPr>
+        <w:fldChar w:fldCharType="begin"/>
+      </w:r>
+      <w:r>
+        <w:rPr>
+          <w:rFonts w:ascii="Times New Roman" w:hAnsi="Times New Roman" w:cs="Times New Roman"/>
+          <w:color w:val="auto"/>
+          <w:sz w:val="26"/>
+          <w:szCs w:val="26"/>
+        </w:rPr>
+        <w:instrText xml:space="preserve"> SEQ Sơ_đồ \* ARABIC </w:instrText>
+      </w:r>
+      <w:r>
+        <w:rPr>
+          <w:rFonts w:ascii="Times New Roman" w:hAnsi="Times New Roman" w:cs="Times New Roman"/>
+          <w:color w:val="auto"/>
+          <w:sz w:val="26"/>
+          <w:szCs w:val="26"/>
+        </w:rPr>
+        <w:fldChar w:fldCharType="separate"/>
+      </w:r>
+      <w:r>
+        <w:rPr>
+          <w:rFonts w:ascii="Times New Roman" w:hAnsi="Times New Roman" w:cs="Times New Roman"/>
+          <w:noProof/>
+          <w:color w:val="auto"/>
+          <w:sz w:val="26"/>
+          <w:szCs w:val="26"/>
+        </w:rPr>
+        <w:t>6</w:t>
+      </w:r>
+      <w:r>
+        <w:rPr>
+          <w:rFonts w:ascii="Times New Roman" w:hAnsi="Times New Roman" w:cs="Times New Roman"/>
+          <w:noProof/>
+          <w:color w:val="auto"/>
+          <w:sz w:val="26"/>
+          <w:szCs w:val="26"/>
+        </w:rPr>
+        <w:fldChar w:fldCharType="end"/>
+      </w:r>
+      <w:r>
+        <w:rPr>
+          <w:rFonts w:ascii="Times New Roman" w:hAnsi="Times New Roman" w:cs="Times New Roman"/>
+          <w:color w:val="auto"/>
+          <w:sz w:val="26"/>
+          <w:szCs w:val="26"/>
           <w:lang w:val="vi-VN"/>
         </w:rPr>
         <w:t>. Activity - Thống kê thư viện</w:t>
@@ -897,10 +1270,18 @@
       <w:pPr>
         <w:keepNext/>
         <w:jc w:val="center"/>
-      </w:pPr>
-      <w:r>
-        <w:rPr>
-          <w:noProof/>
+        <w:rPr>
+          <w:rFonts w:ascii="Times New Roman" w:hAnsi="Times New Roman" w:cs="Times New Roman"/>
+          <w:sz w:val="26"/>
+          <w:szCs w:val="26"/>
+        </w:rPr>
+      </w:pPr>
+      <w:r>
+        <w:rPr>
+          <w:rFonts w:ascii="Times New Roman" w:hAnsi="Times New Roman" w:cs="Times New Roman"/>
+          <w:noProof/>
+          <w:sz w:val="26"/>
+          <w:szCs w:val="26"/>
         </w:rPr>
         <w:drawing>
           <wp:inline distT="0" distB="0" distL="0" distR="0" wp14:anchorId="058D6FB5" wp14:editId="798425EF">
@@ -960,24 +1341,74 @@
           <w:rFonts w:ascii="Times New Roman" w:hAnsi="Times New Roman" w:cs="Times New Roman"/>
           <w:b/>
           <w:bCs/>
-          <w:sz w:val="26"/>
-          <w:szCs w:val="26"/>
-          <w:lang w:val="vi-VN"/>
-        </w:rPr>
-      </w:pPr>
-      <w:r>
+          <w:color w:val="auto"/>
+          <w:sz w:val="26"/>
+          <w:szCs w:val="26"/>
+          <w:lang w:val="vi-VN"/>
+        </w:rPr>
+      </w:pPr>
+      <w:r>
+        <w:rPr>
+          <w:rFonts w:ascii="Times New Roman" w:hAnsi="Times New Roman" w:cs="Times New Roman"/>
+          <w:color w:val="auto"/>
+          <w:sz w:val="26"/>
+          <w:szCs w:val="26"/>
+        </w:rPr>
         <w:t xml:space="preserve">Sơ đồ </w:t>
       </w:r>
-      <w:fldSimple w:instr=" SEQ Sơ_đồ \* ARABIC ">
-        <w:r>
-          <w:rPr>
-            <w:noProof/>
-          </w:rPr>
-          <w:t>7</w:t>
-        </w:r>
-      </w:fldSimple>
-      <w:r>
-        <w:rPr>
+      <w:r>
+        <w:rPr>
+          <w:rFonts w:ascii="Times New Roman" w:hAnsi="Times New Roman" w:cs="Times New Roman"/>
+          <w:color w:val="auto"/>
+          <w:sz w:val="26"/>
+          <w:szCs w:val="26"/>
+        </w:rPr>
+        <w:fldChar w:fldCharType="begin"/>
+      </w:r>
+      <w:r>
+        <w:rPr>
+          <w:rFonts w:ascii="Times New Roman" w:hAnsi="Times New Roman" w:cs="Times New Roman"/>
+          <w:color w:val="auto"/>
+          <w:sz w:val="26"/>
+          <w:szCs w:val="26"/>
+        </w:rPr>
+        <w:instrText xml:space="preserve"> SEQ Sơ_đồ \* ARABIC </w:instrText>
+      </w:r>
+      <w:r>
+        <w:rPr>
+          <w:rFonts w:ascii="Times New Roman" w:hAnsi="Times New Roman" w:cs="Times New Roman"/>
+          <w:color w:val="auto"/>
+          <w:sz w:val="26"/>
+          <w:szCs w:val="26"/>
+        </w:rPr>
+        <w:fldChar w:fldCharType="separate"/>
+      </w:r>
+      <w:r>
+        <w:rPr>
+          <w:rFonts w:ascii="Times New Roman" w:hAnsi="Times New Roman" w:cs="Times New Roman"/>
+          <w:noProof/>
+          <w:color w:val="auto"/>
+          <w:sz w:val="26"/>
+          <w:szCs w:val="26"/>
+        </w:rPr>
+        <w:t>7</w:t>
+      </w:r>
+      <w:r>
+        <w:rPr>
+          <w:rFonts w:ascii="Times New Roman" w:hAnsi="Times New Roman" w:cs="Times New Roman"/>
+          <w:noProof/>
+          <w:color w:val="auto"/>
+          <w:sz w:val="26"/>
+          <w:szCs w:val="26"/>
+        </w:rPr>
+        <w:fldChar w:fldCharType="end"/>
+      </w:r>
+      <w:r>
+        <w:rPr>
+          <w:rFonts w:ascii="Times New Roman" w:hAnsi="Times New Roman" w:cs="Times New Roman"/>
+          <w:color w:val="auto"/>
+          <w:sz w:val="26"/>
+          <w:szCs w:val="26"/>
           <w:lang w:val="vi-VN"/>
         </w:rPr>
         <w:t>. Sequence - Cấp/ Gia hạn thẻ độc giả</w:t>
@@ -987,16 +1418,24 @@
       <w:pPr>
         <w:keepNext/>
         <w:jc w:val="center"/>
-      </w:pPr>
-      <w:r>
-        <w:rPr>
-          <w:noProof/>
+        <w:rPr>
+          <w:rFonts w:ascii="Times New Roman" w:hAnsi="Times New Roman" w:cs="Times New Roman"/>
+          <w:sz w:val="26"/>
+          <w:szCs w:val="26"/>
+        </w:rPr>
+      </w:pPr>
+      <w:r>
+        <w:rPr>
+          <w:rFonts w:ascii="Times New Roman" w:hAnsi="Times New Roman" w:cs="Times New Roman"/>
+          <w:noProof/>
+          <w:sz w:val="26"/>
+          <w:szCs w:val="26"/>
         </w:rPr>
         <w:lastRenderedPageBreak/>
         <w:drawing>
-          <wp:inline distT="0" distB="0" distL="0" distR="0" wp14:anchorId="3E1016E1" wp14:editId="07F5EE17">
-            <wp:extent cx="4810125" cy="8890000"/>
-            <wp:effectExtent l="0" t="0" r="9525" b="6350"/>
+          <wp:inline distT="0" distB="0" distL="0" distR="0" wp14:anchorId="3E1016E1" wp14:editId="0AE388CC">
+            <wp:extent cx="4810125" cy="8839200"/>
+            <wp:effectExtent l="0" t="0" r="9525" b="0"/>
             <wp:docPr id="1904021414" name="Picture 10"/>
             <wp:cNvGraphicFramePr>
               <a:graphicFrameLocks xmlns:a="http://schemas.openxmlformats.org/drawingml/2006/main" noChangeAspect="1"/>
@@ -1026,7 +1465,7 @@
                   <pic:spPr bwMode="auto">
                     <a:xfrm>
                       <a:off x="0" y="0"/>
-                      <a:ext cx="4818024" cy="8904598"/>
+                      <a:ext cx="4818024" cy="8853716"/>
                     </a:xfrm>
                     <a:prstGeom prst="rect">
                       <a:avLst/>
@@ -1051,24 +1490,74 @@
           <w:rFonts w:ascii="Times New Roman" w:hAnsi="Times New Roman" w:cs="Times New Roman"/>
           <w:b/>
           <w:bCs/>
-          <w:sz w:val="26"/>
-          <w:szCs w:val="26"/>
-          <w:lang w:val="vi-VN"/>
-        </w:rPr>
-      </w:pPr>
-      <w:r>
+          <w:color w:val="auto"/>
+          <w:sz w:val="26"/>
+          <w:szCs w:val="26"/>
+          <w:lang w:val="vi-VN"/>
+        </w:rPr>
+      </w:pPr>
+      <w:r>
+        <w:rPr>
+          <w:rFonts w:ascii="Times New Roman" w:hAnsi="Times New Roman" w:cs="Times New Roman"/>
+          <w:color w:val="auto"/>
+          <w:sz w:val="26"/>
+          <w:szCs w:val="26"/>
+        </w:rPr>
         <w:t xml:space="preserve">Sơ đồ </w:t>
       </w:r>
-      <w:fldSimple w:instr=" SEQ Sơ_đồ \* ARABIC ">
-        <w:r>
-          <w:rPr>
-            <w:noProof/>
-          </w:rPr>
-          <w:t>8</w:t>
-        </w:r>
-      </w:fldSimple>
-      <w:r>
-        <w:rPr>
+      <w:r>
+        <w:rPr>
+          <w:rFonts w:ascii="Times New Roman" w:hAnsi="Times New Roman" w:cs="Times New Roman"/>
+          <w:color w:val="auto"/>
+          <w:sz w:val="26"/>
+          <w:szCs w:val="26"/>
+        </w:rPr>
+        <w:fldChar w:fldCharType="begin"/>
+      </w:r>
+      <w:r>
+        <w:rPr>
+          <w:rFonts w:ascii="Times New Roman" w:hAnsi="Times New Roman" w:cs="Times New Roman"/>
+          <w:color w:val="auto"/>
+          <w:sz w:val="26"/>
+          <w:szCs w:val="26"/>
+        </w:rPr>
+        <w:instrText xml:space="preserve"> SEQ Sơ_đồ \* ARABIC </w:instrText>
+      </w:r>
+      <w:r>
+        <w:rPr>
+          <w:rFonts w:ascii="Times New Roman" w:hAnsi="Times New Roman" w:cs="Times New Roman"/>
+          <w:color w:val="auto"/>
+          <w:sz w:val="26"/>
+          <w:szCs w:val="26"/>
+        </w:rPr>
+        <w:fldChar w:fldCharType="separate"/>
+      </w:r>
+      <w:r>
+        <w:rPr>
+          <w:rFonts w:ascii="Times New Roman" w:hAnsi="Times New Roman" w:cs="Times New Roman"/>
+          <w:noProof/>
+          <w:color w:val="auto"/>
+          <w:sz w:val="26"/>
+          <w:szCs w:val="26"/>
+        </w:rPr>
+        <w:t>8</w:t>
+      </w:r>
+      <w:r>
+        <w:rPr>
+          <w:rFonts w:ascii="Times New Roman" w:hAnsi="Times New Roman" w:cs="Times New Roman"/>
+          <w:noProof/>
+          <w:color w:val="auto"/>
+          <w:sz w:val="26"/>
+          <w:szCs w:val="26"/>
+        </w:rPr>
+        <w:fldChar w:fldCharType="end"/>
+      </w:r>
+      <w:r>
+        <w:rPr>
+          <w:rFonts w:ascii="Times New Roman" w:hAnsi="Times New Roman" w:cs="Times New Roman"/>
+          <w:color w:val="auto"/>
+          <w:sz w:val="26"/>
+          <w:szCs w:val="26"/>
           <w:lang w:val="vi-VN"/>
         </w:rPr>
         <w:t>. Sequence - Mượn sách</w:t>
@@ -1078,16 +1567,24 @@
       <w:pPr>
         <w:keepNext/>
         <w:jc w:val="center"/>
-      </w:pPr>
-      <w:r>
-        <w:rPr>
-          <w:noProof/>
+        <w:rPr>
+          <w:rFonts w:ascii="Times New Roman" w:hAnsi="Times New Roman" w:cs="Times New Roman"/>
+          <w:sz w:val="26"/>
+          <w:szCs w:val="26"/>
+        </w:rPr>
+      </w:pPr>
+      <w:r>
+        <w:rPr>
+          <w:rFonts w:ascii="Times New Roman" w:hAnsi="Times New Roman" w:cs="Times New Roman"/>
+          <w:noProof/>
+          <w:sz w:val="26"/>
+          <w:szCs w:val="26"/>
         </w:rPr>
         <w:lastRenderedPageBreak/>
         <w:drawing>
-          <wp:inline distT="0" distB="0" distL="0" distR="0" wp14:anchorId="68A5F788" wp14:editId="711C8CFE">
-            <wp:extent cx="5183505" cy="8909050"/>
-            <wp:effectExtent l="0" t="0" r="0" b="6350"/>
+          <wp:inline distT="0" distB="0" distL="0" distR="0" wp14:anchorId="68A5F788" wp14:editId="6AE17BD1">
+            <wp:extent cx="5131781" cy="8820150"/>
+            <wp:effectExtent l="0" t="0" r="0" b="0"/>
             <wp:docPr id="216876515" name="Picture 11" descr="PlantUML Diagram"/>
             <wp:cNvGraphicFramePr>
               <a:graphicFrameLocks xmlns:a="http://schemas.openxmlformats.org/drawingml/2006/main" noChangeAspect="1"/>
@@ -1117,7 +1614,7 @@
                   <pic:spPr bwMode="auto">
                     <a:xfrm>
                       <a:off x="0" y="0"/>
-                      <a:ext cx="5190127" cy="8920431"/>
+                      <a:ext cx="5139429" cy="8833294"/>
                     </a:xfrm>
                     <a:prstGeom prst="rect">
                       <a:avLst/>
@@ -1142,24 +1639,74 @@
           <w:rFonts w:ascii="Times New Roman" w:hAnsi="Times New Roman" w:cs="Times New Roman"/>
           <w:b/>
           <w:bCs/>
-          <w:sz w:val="26"/>
-          <w:szCs w:val="26"/>
-          <w:lang w:val="vi-VN"/>
-        </w:rPr>
-      </w:pPr>
-      <w:r>
+          <w:color w:val="auto"/>
+          <w:sz w:val="26"/>
+          <w:szCs w:val="26"/>
+          <w:lang w:val="vi-VN"/>
+        </w:rPr>
+      </w:pPr>
+      <w:r>
+        <w:rPr>
+          <w:rFonts w:ascii="Times New Roman" w:hAnsi="Times New Roman" w:cs="Times New Roman"/>
+          <w:color w:val="auto"/>
+          <w:sz w:val="26"/>
+          <w:szCs w:val="26"/>
+        </w:rPr>
         <w:t xml:space="preserve">Sơ đồ </w:t>
       </w:r>
-      <w:fldSimple w:instr=" SEQ Sơ_đồ \* ARABIC ">
-        <w:r>
-          <w:rPr>
-            <w:noProof/>
-          </w:rPr>
-          <w:t>9</w:t>
-        </w:r>
-      </w:fldSimple>
-      <w:r>
-        <w:rPr>
+      <w:r>
+        <w:rPr>
+          <w:rFonts w:ascii="Times New Roman" w:hAnsi="Times New Roman" w:cs="Times New Roman"/>
+          <w:color w:val="auto"/>
+          <w:sz w:val="26"/>
+          <w:szCs w:val="26"/>
+        </w:rPr>
+        <w:fldChar w:fldCharType="begin"/>
+      </w:r>
+      <w:r>
+        <w:rPr>
+          <w:rFonts w:ascii="Times New Roman" w:hAnsi="Times New Roman" w:cs="Times New Roman"/>
+          <w:color w:val="auto"/>
+          <w:sz w:val="26"/>
+          <w:szCs w:val="26"/>
+        </w:rPr>
+        <w:instrText xml:space="preserve"> SEQ Sơ_đồ \* ARABIC </w:instrText>
+      </w:r>
+      <w:r>
+        <w:rPr>
+          <w:rFonts w:ascii="Times New Roman" w:hAnsi="Times New Roman" w:cs="Times New Roman"/>
+          <w:color w:val="auto"/>
+          <w:sz w:val="26"/>
+          <w:szCs w:val="26"/>
+        </w:rPr>
+        <w:fldChar w:fldCharType="separate"/>
+      </w:r>
+      <w:r>
+        <w:rPr>
+          <w:rFonts w:ascii="Times New Roman" w:hAnsi="Times New Roman" w:cs="Times New Roman"/>
+          <w:noProof/>
+          <w:color w:val="auto"/>
+          <w:sz w:val="26"/>
+          <w:szCs w:val="26"/>
+        </w:rPr>
+        <w:t>9</w:t>
+      </w:r>
+      <w:r>
+        <w:rPr>
+          <w:rFonts w:ascii="Times New Roman" w:hAnsi="Times New Roman" w:cs="Times New Roman"/>
+          <w:noProof/>
+          <w:color w:val="auto"/>
+          <w:sz w:val="26"/>
+          <w:szCs w:val="26"/>
+        </w:rPr>
+        <w:fldChar w:fldCharType="end"/>
+      </w:r>
+      <w:r>
+        <w:rPr>
+          <w:rFonts w:ascii="Times New Roman" w:hAnsi="Times New Roman" w:cs="Times New Roman"/>
+          <w:color w:val="auto"/>
+          <w:sz w:val="26"/>
+          <w:szCs w:val="26"/>
           <w:lang w:val="vi-VN"/>
         </w:rPr>
         <w:t>. Sequence - Trả sách và lập phiếu phạt</w:t>
@@ -1169,16 +1716,24 @@
       <w:pPr>
         <w:keepNext/>
         <w:jc w:val="center"/>
-      </w:pPr>
-      <w:r>
-        <w:rPr>
-          <w:noProof/>
+        <w:rPr>
+          <w:rFonts w:ascii="Times New Roman" w:hAnsi="Times New Roman" w:cs="Times New Roman"/>
+          <w:sz w:val="26"/>
+          <w:szCs w:val="26"/>
+        </w:rPr>
+      </w:pPr>
+      <w:r>
+        <w:rPr>
+          <w:rFonts w:ascii="Times New Roman" w:hAnsi="Times New Roman" w:cs="Times New Roman"/>
+          <w:noProof/>
+          <w:sz w:val="26"/>
+          <w:szCs w:val="26"/>
         </w:rPr>
         <w:lastRenderedPageBreak/>
         <w:drawing>
-          <wp:inline distT="0" distB="0" distL="0" distR="0" wp14:anchorId="62A0CF98" wp14:editId="625C2FB1">
-            <wp:extent cx="6230599" cy="8890000"/>
-            <wp:effectExtent l="0" t="0" r="0" b="6350"/>
+          <wp:inline distT="0" distB="0" distL="0" distR="0" wp14:anchorId="62A0CF98" wp14:editId="38809047">
+            <wp:extent cx="6163843" cy="8794750"/>
+            <wp:effectExtent l="0" t="0" r="8890" b="6350"/>
             <wp:docPr id="388400202" name="Picture 12" descr="PlantUML Diagram"/>
             <wp:cNvGraphicFramePr>
               <a:graphicFrameLocks xmlns:a="http://schemas.openxmlformats.org/drawingml/2006/main" noChangeAspect="1"/>
@@ -1208,7 +1763,7 @@
                   <pic:spPr bwMode="auto">
                     <a:xfrm>
                       <a:off x="0" y="0"/>
-                      <a:ext cx="6240582" cy="8904244"/>
+                      <a:ext cx="6175452" cy="8811314"/>
                     </a:xfrm>
                     <a:prstGeom prst="rect">
                       <a:avLst/>
@@ -1233,24 +1788,74 @@
           <w:rFonts w:ascii="Times New Roman" w:hAnsi="Times New Roman" w:cs="Times New Roman"/>
           <w:b/>
           <w:bCs/>
-          <w:sz w:val="26"/>
-          <w:szCs w:val="26"/>
-          <w:lang w:val="vi-VN"/>
-        </w:rPr>
-      </w:pPr>
-      <w:r>
+          <w:color w:val="auto"/>
+          <w:sz w:val="26"/>
+          <w:szCs w:val="26"/>
+          <w:lang w:val="vi-VN"/>
+        </w:rPr>
+      </w:pPr>
+      <w:r>
+        <w:rPr>
+          <w:rFonts w:ascii="Times New Roman" w:hAnsi="Times New Roman" w:cs="Times New Roman"/>
+          <w:color w:val="auto"/>
+          <w:sz w:val="26"/>
+          <w:szCs w:val="26"/>
+        </w:rPr>
         <w:t xml:space="preserve">Sơ đồ </w:t>
       </w:r>
-      <w:fldSimple w:instr=" SEQ Sơ_đồ \* ARABIC ">
-        <w:r>
-          <w:rPr>
-            <w:noProof/>
-          </w:rPr>
-          <w:t>10</w:t>
-        </w:r>
-      </w:fldSimple>
-      <w:r>
-        <w:rPr>
+      <w:r>
+        <w:rPr>
+          <w:rFonts w:ascii="Times New Roman" w:hAnsi="Times New Roman" w:cs="Times New Roman"/>
+          <w:color w:val="auto"/>
+          <w:sz w:val="26"/>
+          <w:szCs w:val="26"/>
+        </w:rPr>
+        <w:fldChar w:fldCharType="begin"/>
+      </w:r>
+      <w:r>
+        <w:rPr>
+          <w:rFonts w:ascii="Times New Roman" w:hAnsi="Times New Roman" w:cs="Times New Roman"/>
+          <w:color w:val="auto"/>
+          <w:sz w:val="26"/>
+          <w:szCs w:val="26"/>
+        </w:rPr>
+        <w:instrText xml:space="preserve"> SEQ Sơ_đồ \* ARABIC </w:instrText>
+      </w:r>
+      <w:r>
+        <w:rPr>
+          <w:rFonts w:ascii="Times New Roman" w:hAnsi="Times New Roman" w:cs="Times New Roman"/>
+          <w:color w:val="auto"/>
+          <w:sz w:val="26"/>
+          <w:szCs w:val="26"/>
+        </w:rPr>
+        <w:fldChar w:fldCharType="separate"/>
+      </w:r>
+      <w:r>
+        <w:rPr>
+          <w:rFonts w:ascii="Times New Roman" w:hAnsi="Times New Roman" w:cs="Times New Roman"/>
+          <w:noProof/>
+          <w:color w:val="auto"/>
+          <w:sz w:val="26"/>
+          <w:szCs w:val="26"/>
+        </w:rPr>
+        <w:t>10</w:t>
+      </w:r>
+      <w:r>
+        <w:rPr>
+          <w:rFonts w:ascii="Times New Roman" w:hAnsi="Times New Roman" w:cs="Times New Roman"/>
+          <w:noProof/>
+          <w:color w:val="auto"/>
+          <w:sz w:val="26"/>
+          <w:szCs w:val="26"/>
+        </w:rPr>
+        <w:fldChar w:fldCharType="end"/>
+      </w:r>
+      <w:r>
+        <w:rPr>
+          <w:rFonts w:ascii="Times New Roman" w:hAnsi="Times New Roman" w:cs="Times New Roman"/>
+          <w:color w:val="auto"/>
+          <w:sz w:val="26"/>
+          <w:szCs w:val="26"/>
           <w:lang w:val="vi-VN"/>
         </w:rPr>
         <w:t>. Sequence - Quản lý đầu sách</w:t>
@@ -1260,10 +1865,18 @@
       <w:pPr>
         <w:keepNext/>
         <w:jc w:val="center"/>
-      </w:pPr>
-      <w:r>
-        <w:rPr>
-          <w:noProof/>
+        <w:rPr>
+          <w:rFonts w:ascii="Times New Roman" w:hAnsi="Times New Roman" w:cs="Times New Roman"/>
+          <w:sz w:val="26"/>
+          <w:szCs w:val="26"/>
+        </w:rPr>
+      </w:pPr>
+      <w:r>
+        <w:rPr>
+          <w:rFonts w:ascii="Times New Roman" w:hAnsi="Times New Roman" w:cs="Times New Roman"/>
+          <w:noProof/>
+          <w:sz w:val="26"/>
+          <w:szCs w:val="26"/>
         </w:rPr>
         <w:lastRenderedPageBreak/>
         <w:drawing>
@@ -1324,24 +1937,74 @@
           <w:rFonts w:ascii="Times New Roman" w:hAnsi="Times New Roman" w:cs="Times New Roman"/>
           <w:b/>
           <w:bCs/>
-          <w:sz w:val="26"/>
-          <w:szCs w:val="26"/>
-          <w:lang w:val="vi-VN"/>
-        </w:rPr>
-      </w:pPr>
-      <w:r>
+          <w:color w:val="auto"/>
+          <w:sz w:val="26"/>
+          <w:szCs w:val="26"/>
+          <w:lang w:val="vi-VN"/>
+        </w:rPr>
+      </w:pPr>
+      <w:r>
+        <w:rPr>
+          <w:rFonts w:ascii="Times New Roman" w:hAnsi="Times New Roman" w:cs="Times New Roman"/>
+          <w:color w:val="auto"/>
+          <w:sz w:val="26"/>
+          <w:szCs w:val="26"/>
+        </w:rPr>
         <w:t xml:space="preserve">Sơ đồ </w:t>
       </w:r>
-      <w:fldSimple w:instr=" SEQ Sơ_đồ \* ARABIC ">
-        <w:r>
-          <w:rPr>
-            <w:noProof/>
-          </w:rPr>
-          <w:t>11</w:t>
-        </w:r>
-      </w:fldSimple>
-      <w:r>
-        <w:rPr>
+      <w:r>
+        <w:rPr>
+          <w:rFonts w:ascii="Times New Roman" w:hAnsi="Times New Roman" w:cs="Times New Roman"/>
+          <w:color w:val="auto"/>
+          <w:sz w:val="26"/>
+          <w:szCs w:val="26"/>
+        </w:rPr>
+        <w:fldChar w:fldCharType="begin"/>
+      </w:r>
+      <w:r>
+        <w:rPr>
+          <w:rFonts w:ascii="Times New Roman" w:hAnsi="Times New Roman" w:cs="Times New Roman"/>
+          <w:color w:val="auto"/>
+          <w:sz w:val="26"/>
+          <w:szCs w:val="26"/>
+        </w:rPr>
+        <w:instrText xml:space="preserve"> SEQ Sơ_đồ \* ARABIC </w:instrText>
+      </w:r>
+      <w:r>
+        <w:rPr>
+          <w:rFonts w:ascii="Times New Roman" w:hAnsi="Times New Roman" w:cs="Times New Roman"/>
+          <w:color w:val="auto"/>
+          <w:sz w:val="26"/>
+          <w:szCs w:val="26"/>
+        </w:rPr>
+        <w:fldChar w:fldCharType="separate"/>
+      </w:r>
+      <w:r>
+        <w:rPr>
+          <w:rFonts w:ascii="Times New Roman" w:hAnsi="Times New Roman" w:cs="Times New Roman"/>
+          <w:noProof/>
+          <w:color w:val="auto"/>
+          <w:sz w:val="26"/>
+          <w:szCs w:val="26"/>
+        </w:rPr>
+        <w:t>11</w:t>
+      </w:r>
+      <w:r>
+        <w:rPr>
+          <w:rFonts w:ascii="Times New Roman" w:hAnsi="Times New Roman" w:cs="Times New Roman"/>
+          <w:noProof/>
+          <w:color w:val="auto"/>
+          <w:sz w:val="26"/>
+          <w:szCs w:val="26"/>
+        </w:rPr>
+        <w:fldChar w:fldCharType="end"/>
+      </w:r>
+      <w:r>
+        <w:rPr>
+          <w:rFonts w:ascii="Times New Roman" w:hAnsi="Times New Roman" w:cs="Times New Roman"/>
+          <w:color w:val="auto"/>
+          <w:sz w:val="26"/>
+          <w:szCs w:val="26"/>
           <w:lang w:val="vi-VN"/>
         </w:rPr>
         <w:t>. Sequence - Thống kê thư viện</w:t>
@@ -1490,6 +2153,11 @@
     <w:p>
       <w:pPr>
         <w:keepNext/>
+        <w:rPr>
+          <w:rFonts w:ascii="Times New Roman" w:hAnsi="Times New Roman" w:cs="Times New Roman"/>
+          <w:sz w:val="26"/>
+          <w:szCs w:val="26"/>
+        </w:rPr>
       </w:pPr>
       <w:r>
         <w:rPr>
@@ -1559,23 +2227,73 @@
         <w:jc w:val="center"/>
         <w:rPr>
           <w:rFonts w:ascii="Times New Roman" w:hAnsi="Times New Roman" w:cs="Times New Roman"/>
-          <w:sz w:val="26"/>
-          <w:szCs w:val="26"/>
-        </w:rPr>
-      </w:pPr>
-      <w:r>
+          <w:color w:val="auto"/>
+          <w:sz w:val="26"/>
+          <w:szCs w:val="26"/>
+        </w:rPr>
+      </w:pPr>
+      <w:r>
+        <w:rPr>
+          <w:rFonts w:ascii="Times New Roman" w:hAnsi="Times New Roman" w:cs="Times New Roman"/>
+          <w:color w:val="auto"/>
+          <w:sz w:val="26"/>
+          <w:szCs w:val="26"/>
+        </w:rPr>
         <w:t xml:space="preserve">Sơ đồ </w:t>
       </w:r>
-      <w:fldSimple w:instr=" SEQ Sơ_đồ \* ARABIC ">
-        <w:r>
-          <w:rPr>
-            <w:noProof/>
-          </w:rPr>
-          <w:t>12</w:t>
-        </w:r>
-      </w:fldSimple>
-      <w:r>
-        <w:rPr>
+      <w:r>
+        <w:rPr>
+          <w:rFonts w:ascii="Times New Roman" w:hAnsi="Times New Roman" w:cs="Times New Roman"/>
+          <w:color w:val="auto"/>
+          <w:sz w:val="26"/>
+          <w:szCs w:val="26"/>
+        </w:rPr>
+        <w:fldChar w:fldCharType="begin"/>
+      </w:r>
+      <w:r>
+        <w:rPr>
+          <w:rFonts w:ascii="Times New Roman" w:hAnsi="Times New Roman" w:cs="Times New Roman"/>
+          <w:color w:val="auto"/>
+          <w:sz w:val="26"/>
+          <w:szCs w:val="26"/>
+        </w:rPr>
+        <w:instrText xml:space="preserve"> SEQ Sơ_đồ \* ARABIC </w:instrText>
+      </w:r>
+      <w:r>
+        <w:rPr>
+          <w:rFonts w:ascii="Times New Roman" w:hAnsi="Times New Roman" w:cs="Times New Roman"/>
+          <w:color w:val="auto"/>
+          <w:sz w:val="26"/>
+          <w:szCs w:val="26"/>
+        </w:rPr>
+        <w:fldChar w:fldCharType="separate"/>
+      </w:r>
+      <w:r>
+        <w:rPr>
+          <w:rFonts w:ascii="Times New Roman" w:hAnsi="Times New Roman" w:cs="Times New Roman"/>
+          <w:noProof/>
+          <w:color w:val="auto"/>
+          <w:sz w:val="26"/>
+          <w:szCs w:val="26"/>
+        </w:rPr>
+        <w:t>12</w:t>
+      </w:r>
+      <w:r>
+        <w:rPr>
+          <w:rFonts w:ascii="Times New Roman" w:hAnsi="Times New Roman" w:cs="Times New Roman"/>
+          <w:noProof/>
+          <w:color w:val="auto"/>
+          <w:sz w:val="26"/>
+          <w:szCs w:val="26"/>
+        </w:rPr>
+        <w:fldChar w:fldCharType="end"/>
+      </w:r>
+      <w:r>
+        <w:rPr>
+          <w:rFonts w:ascii="Times New Roman" w:hAnsi="Times New Roman" w:cs="Times New Roman"/>
+          <w:color w:val="auto"/>
+          <w:sz w:val="26"/>
+          <w:szCs w:val="26"/>
           <w:lang w:val="vi-VN"/>
         </w:rPr>
         <w:t>. ERD - Hệ thống quản lý thư viện</w:t>
@@ -1698,12 +2416,18 @@
       <w:pPr>
         <w:keepNext/>
         <w:jc w:val="center"/>
-      </w:pPr>
-      <w:r>
-        <w:rPr>
-          <w:rFonts w:ascii="Times New Roman" w:hAnsi="Times New Roman" w:cs="Times New Roman"/>
-          <w:b/>
-          <w:bCs/>
+        <w:rPr>
+          <w:rFonts w:ascii="Times New Roman" w:hAnsi="Times New Roman" w:cs="Times New Roman"/>
+          <w:sz w:val="26"/>
+          <w:szCs w:val="26"/>
+        </w:rPr>
+      </w:pPr>
+      <w:r>
+        <w:rPr>
+          <w:rFonts w:ascii="Times New Roman" w:hAnsi="Times New Roman" w:cs="Times New Roman"/>
+          <w:b/>
+          <w:bCs/>
+          <w:noProof/>
           <w:sz w:val="26"/>
           <w:szCs w:val="26"/>
           <w:lang w:val="vi-VN"/>
@@ -1753,37 +2477,95 @@
           <w:rFonts w:ascii="Times New Roman" w:hAnsi="Times New Roman" w:cs="Times New Roman"/>
           <w:b/>
           <w:bCs/>
-          <w:sz w:val="26"/>
-          <w:szCs w:val="26"/>
-          <w:lang w:val="vi-VN"/>
-        </w:rPr>
-      </w:pPr>
-      <w:r>
+          <w:color w:val="auto"/>
+          <w:sz w:val="26"/>
+          <w:szCs w:val="26"/>
+          <w:lang w:val="vi-VN"/>
+        </w:rPr>
+      </w:pPr>
+      <w:r>
+        <w:rPr>
+          <w:rFonts w:ascii="Times New Roman" w:hAnsi="Times New Roman" w:cs="Times New Roman"/>
+          <w:color w:val="auto"/>
+          <w:sz w:val="26"/>
+          <w:szCs w:val="26"/>
+        </w:rPr>
         <w:t xml:space="preserve">Hình </w:t>
       </w:r>
-      <w:fldSimple w:instr=" SEQ Hình \* ARABIC ">
-        <w:r>
-          <w:rPr>
-            <w:noProof/>
-          </w:rPr>
-          <w:t>1</w:t>
-        </w:r>
-      </w:fldSimple>
-      <w:r>
-        <w:rPr>
+      <w:r>
+        <w:rPr>
+          <w:rFonts w:ascii="Times New Roman" w:hAnsi="Times New Roman" w:cs="Times New Roman"/>
+          <w:color w:val="auto"/>
+          <w:sz w:val="26"/>
+          <w:szCs w:val="26"/>
+        </w:rPr>
+        <w:fldChar w:fldCharType="begin"/>
+      </w:r>
+      <w:r>
+        <w:rPr>
+          <w:rFonts w:ascii="Times New Roman" w:hAnsi="Times New Roman" w:cs="Times New Roman"/>
+          <w:color w:val="auto"/>
+          <w:sz w:val="26"/>
+          <w:szCs w:val="26"/>
+        </w:rPr>
+        <w:instrText xml:space="preserve"> SEQ Hình \* ARABIC </w:instrText>
+      </w:r>
+      <w:r>
+        <w:rPr>
+          <w:rFonts w:ascii="Times New Roman" w:hAnsi="Times New Roman" w:cs="Times New Roman"/>
+          <w:color w:val="auto"/>
+          <w:sz w:val="26"/>
+          <w:szCs w:val="26"/>
+        </w:rPr>
+        <w:fldChar w:fldCharType="separate"/>
+      </w:r>
+      <w:r>
+        <w:rPr>
+          <w:rFonts w:ascii="Times New Roman" w:hAnsi="Times New Roman" w:cs="Times New Roman"/>
+          <w:noProof/>
+          <w:color w:val="auto"/>
+          <w:sz w:val="26"/>
+          <w:szCs w:val="26"/>
+        </w:rPr>
+        <w:t>1</w:t>
+      </w:r>
+      <w:r>
+        <w:rPr>
+          <w:rFonts w:ascii="Times New Roman" w:hAnsi="Times New Roman" w:cs="Times New Roman"/>
+          <w:noProof/>
+          <w:color w:val="auto"/>
+          <w:sz w:val="26"/>
+          <w:szCs w:val="26"/>
+        </w:rPr>
+        <w:fldChar w:fldCharType="end"/>
+      </w:r>
+      <w:r>
+        <w:rPr>
+          <w:rFonts w:ascii="Times New Roman" w:hAnsi="Times New Roman" w:cs="Times New Roman"/>
+          <w:color w:val="auto"/>
+          <w:sz w:val="26"/>
+          <w:szCs w:val="26"/>
           <w:lang w:val="vi-VN"/>
         </w:rPr>
         <w:t xml:space="preserve">. Giao diện </w:t>
       </w:r>
       <w:r>
         <w:rPr>
-          <w:noProof/>
+          <w:rFonts w:ascii="Times New Roman" w:hAnsi="Times New Roman" w:cs="Times New Roman"/>
+          <w:noProof/>
+          <w:color w:val="auto"/>
+          <w:sz w:val="26"/>
+          <w:szCs w:val="26"/>
         </w:rPr>
         <w:t>trang</w:t>
       </w:r>
       <w:r>
         <w:rPr>
-          <w:noProof/>
+          <w:rFonts w:ascii="Times New Roman" w:hAnsi="Times New Roman" w:cs="Times New Roman"/>
+          <w:noProof/>
+          <w:color w:val="auto"/>
+          <w:sz w:val="26"/>
+          <w:szCs w:val="26"/>
           <w:lang w:val="vi-VN"/>
         </w:rPr>
         <w:t xml:space="preserve"> chủ</w:t>
@@ -1806,12 +2588,18 @@
       <w:pPr>
         <w:keepNext/>
         <w:jc w:val="center"/>
-      </w:pPr>
-      <w:r>
-        <w:rPr>
-          <w:rFonts w:ascii="Times New Roman" w:hAnsi="Times New Roman" w:cs="Times New Roman"/>
-          <w:b/>
-          <w:bCs/>
+        <w:rPr>
+          <w:rFonts w:ascii="Times New Roman" w:hAnsi="Times New Roman" w:cs="Times New Roman"/>
+          <w:sz w:val="26"/>
+          <w:szCs w:val="26"/>
+        </w:rPr>
+      </w:pPr>
+      <w:r>
+        <w:rPr>
+          <w:rFonts w:ascii="Times New Roman" w:hAnsi="Times New Roman" w:cs="Times New Roman"/>
+          <w:b/>
+          <w:bCs/>
+          <w:noProof/>
           <w:sz w:val="26"/>
           <w:szCs w:val="26"/>
           <w:lang w:val="vi-VN"/>
@@ -1861,24 +2649,74 @@
           <w:rFonts w:ascii="Times New Roman" w:hAnsi="Times New Roman" w:cs="Times New Roman"/>
           <w:b/>
           <w:bCs/>
-          <w:sz w:val="26"/>
-          <w:szCs w:val="26"/>
-          <w:lang w:val="vi-VN"/>
-        </w:rPr>
-      </w:pPr>
-      <w:r>
+          <w:color w:val="auto"/>
+          <w:sz w:val="26"/>
+          <w:szCs w:val="26"/>
+          <w:lang w:val="vi-VN"/>
+        </w:rPr>
+      </w:pPr>
+      <w:r>
+        <w:rPr>
+          <w:rFonts w:ascii="Times New Roman" w:hAnsi="Times New Roman" w:cs="Times New Roman"/>
+          <w:color w:val="auto"/>
+          <w:sz w:val="26"/>
+          <w:szCs w:val="26"/>
+        </w:rPr>
         <w:t xml:space="preserve">Hình </w:t>
       </w:r>
-      <w:fldSimple w:instr=" SEQ Hình \* ARABIC ">
-        <w:r>
-          <w:rPr>
-            <w:noProof/>
-          </w:rPr>
-          <w:t>2</w:t>
-        </w:r>
-      </w:fldSimple>
-      <w:r>
-        <w:rPr>
+      <w:r>
+        <w:rPr>
+          <w:rFonts w:ascii="Times New Roman" w:hAnsi="Times New Roman" w:cs="Times New Roman"/>
+          <w:color w:val="auto"/>
+          <w:sz w:val="26"/>
+          <w:szCs w:val="26"/>
+        </w:rPr>
+        <w:fldChar w:fldCharType="begin"/>
+      </w:r>
+      <w:r>
+        <w:rPr>
+          <w:rFonts w:ascii="Times New Roman" w:hAnsi="Times New Roman" w:cs="Times New Roman"/>
+          <w:color w:val="auto"/>
+          <w:sz w:val="26"/>
+          <w:szCs w:val="26"/>
+        </w:rPr>
+        <w:instrText xml:space="preserve"> SEQ Hình \* ARABIC </w:instrText>
+      </w:r>
+      <w:r>
+        <w:rPr>
+          <w:rFonts w:ascii="Times New Roman" w:hAnsi="Times New Roman" w:cs="Times New Roman"/>
+          <w:color w:val="auto"/>
+          <w:sz w:val="26"/>
+          <w:szCs w:val="26"/>
+        </w:rPr>
+        <w:fldChar w:fldCharType="separate"/>
+      </w:r>
+      <w:r>
+        <w:rPr>
+          <w:rFonts w:ascii="Times New Roman" w:hAnsi="Times New Roman" w:cs="Times New Roman"/>
+          <w:noProof/>
+          <w:color w:val="auto"/>
+          <w:sz w:val="26"/>
+          <w:szCs w:val="26"/>
+        </w:rPr>
+        <w:t>2</w:t>
+      </w:r>
+      <w:r>
+        <w:rPr>
+          <w:rFonts w:ascii="Times New Roman" w:hAnsi="Times New Roman" w:cs="Times New Roman"/>
+          <w:noProof/>
+          <w:color w:val="auto"/>
+          <w:sz w:val="26"/>
+          <w:szCs w:val="26"/>
+        </w:rPr>
+        <w:fldChar w:fldCharType="end"/>
+      </w:r>
+      <w:r>
+        <w:rPr>
+          <w:rFonts w:ascii="Times New Roman" w:hAnsi="Times New Roman" w:cs="Times New Roman"/>
+          <w:color w:val="auto"/>
+          <w:sz w:val="26"/>
+          <w:szCs w:val="26"/>
           <w:lang w:val="vi-VN"/>
         </w:rPr>
         <w:t>. Giao diện "Danh mục/ Nhân viên"</w:t>
@@ -1888,17 +2726,46 @@
       <w:pPr>
         <w:keepNext/>
         <w:jc w:val="center"/>
-      </w:pPr>
-      <w:r>
-        <w:rPr>
-          <w:rFonts w:ascii="Times New Roman" w:hAnsi="Times New Roman" w:cs="Times New Roman"/>
-          <w:b/>
-          <w:bCs/>
-          <w:sz w:val="26"/>
-          <w:szCs w:val="26"/>
-          <w:lang w:val="vi-VN"/>
-        </w:rPr>
-        <w:lastRenderedPageBreak/>
+        <w:rPr>
+          <w:rFonts w:ascii="Times New Roman" w:hAnsi="Times New Roman" w:cs="Times New Roman"/>
+          <w:sz w:val="26"/>
+          <w:szCs w:val="26"/>
+          <w:lang w:val="vi-VN"/>
+        </w:rPr>
+      </w:pPr>
+    </w:p>
+    <w:p>
+      <w:pPr>
+        <w:keepNext/>
+        <w:jc w:val="center"/>
+        <w:rPr>
+          <w:rFonts w:ascii="Times New Roman" w:hAnsi="Times New Roman" w:cs="Times New Roman"/>
+          <w:sz w:val="26"/>
+          <w:szCs w:val="26"/>
+          <w:lang w:val="vi-VN"/>
+        </w:rPr>
+      </w:pPr>
+    </w:p>
+    <w:p>
+      <w:pPr>
+        <w:keepNext/>
+        <w:jc w:val="center"/>
+        <w:rPr>
+          <w:rFonts w:ascii="Times New Roman" w:hAnsi="Times New Roman" w:cs="Times New Roman"/>
+          <w:sz w:val="26"/>
+          <w:szCs w:val="26"/>
+        </w:rPr>
+      </w:pPr>
+      <w:r>
+        <w:rPr>
+          <w:rFonts w:ascii="Times New Roman" w:hAnsi="Times New Roman" w:cs="Times New Roman"/>
+          <w:b/>
+          <w:bCs/>
+          <w:noProof/>
+          <w:sz w:val="26"/>
+          <w:szCs w:val="26"/>
+          <w:lang w:val="vi-VN"/>
+        </w:rPr>
         <w:drawing>
           <wp:inline distT="0" distB="0" distL="0" distR="0" wp14:anchorId="2A69D7B6" wp14:editId="1702F703">
             <wp:extent cx="6471920" cy="2964180"/>
@@ -1942,26 +2809,74 @@
         <w:jc w:val="center"/>
         <w:rPr>
           <w:rFonts w:ascii="Times New Roman" w:hAnsi="Times New Roman" w:cs="Times New Roman"/>
-          <w:b/>
-          <w:bCs/>
-          <w:sz w:val="26"/>
-          <w:szCs w:val="26"/>
-          <w:lang w:val="vi-VN"/>
-        </w:rPr>
-      </w:pPr>
-      <w:r>
+          <w:color w:val="auto"/>
+          <w:sz w:val="26"/>
+          <w:szCs w:val="26"/>
+          <w:lang w:val="vi-VN"/>
+        </w:rPr>
+      </w:pPr>
+      <w:r>
+        <w:rPr>
+          <w:rFonts w:ascii="Times New Roman" w:hAnsi="Times New Roman" w:cs="Times New Roman"/>
+          <w:color w:val="auto"/>
+          <w:sz w:val="26"/>
+          <w:szCs w:val="26"/>
+        </w:rPr>
         <w:t xml:space="preserve">Hình </w:t>
       </w:r>
-      <w:fldSimple w:instr=" SEQ Hình \* ARABIC ">
-        <w:r>
-          <w:rPr>
-            <w:noProof/>
-          </w:rPr>
-          <w:t>3</w:t>
-        </w:r>
-      </w:fldSimple>
-      <w:r>
-        <w:rPr>
+      <w:r>
+        <w:rPr>
+          <w:rFonts w:ascii="Times New Roman" w:hAnsi="Times New Roman" w:cs="Times New Roman"/>
+          <w:color w:val="auto"/>
+          <w:sz w:val="26"/>
+          <w:szCs w:val="26"/>
+        </w:rPr>
+        <w:fldChar w:fldCharType="begin"/>
+      </w:r>
+      <w:r>
+        <w:rPr>
+          <w:rFonts w:ascii="Times New Roman" w:hAnsi="Times New Roman" w:cs="Times New Roman"/>
+          <w:color w:val="auto"/>
+          <w:sz w:val="26"/>
+          <w:szCs w:val="26"/>
+        </w:rPr>
+        <w:instrText xml:space="preserve"> SEQ Hình \* ARABIC </w:instrText>
+      </w:r>
+      <w:r>
+        <w:rPr>
+          <w:rFonts w:ascii="Times New Roman" w:hAnsi="Times New Roman" w:cs="Times New Roman"/>
+          <w:color w:val="auto"/>
+          <w:sz w:val="26"/>
+          <w:szCs w:val="26"/>
+        </w:rPr>
+        <w:fldChar w:fldCharType="separate"/>
+      </w:r>
+      <w:r>
+        <w:rPr>
+          <w:rFonts w:ascii="Times New Roman" w:hAnsi="Times New Roman" w:cs="Times New Roman"/>
+          <w:noProof/>
+          <w:color w:val="auto"/>
+          <w:sz w:val="26"/>
+          <w:szCs w:val="26"/>
+        </w:rPr>
+        <w:t>3</w:t>
+      </w:r>
+      <w:r>
+        <w:rPr>
+          <w:rFonts w:ascii="Times New Roman" w:hAnsi="Times New Roman" w:cs="Times New Roman"/>
+          <w:noProof/>
+          <w:color w:val="auto"/>
+          <w:sz w:val="26"/>
+          <w:szCs w:val="26"/>
+        </w:rPr>
+        <w:fldChar w:fldCharType="end"/>
+      </w:r>
+      <w:r>
+        <w:rPr>
+          <w:rFonts w:ascii="Times New Roman" w:hAnsi="Times New Roman" w:cs="Times New Roman"/>
+          <w:color w:val="auto"/>
+          <w:sz w:val="26"/>
+          <w:szCs w:val="26"/>
           <w:lang w:val="vi-VN"/>
         </w:rPr>
         <w:t>. Giao diện "Danh mục/Thể loại"</w:t>
@@ -1969,14 +2884,34 @@
     </w:p>
     <w:p>
       <w:pPr>
+        <w:rPr>
+          <w:lang w:val="vi-VN"/>
+        </w:rPr>
+      </w:pPr>
+    </w:p>
+    <w:p>
+      <w:pPr>
+        <w:rPr>
+          <w:lang w:val="vi-VN"/>
+        </w:rPr>
+      </w:pPr>
+    </w:p>
+    <w:p>
+      <w:pPr>
         <w:keepNext/>
         <w:jc w:val="center"/>
-      </w:pPr>
-      <w:r>
-        <w:rPr>
-          <w:rFonts w:ascii="Times New Roman" w:hAnsi="Times New Roman" w:cs="Times New Roman"/>
-          <w:b/>
-          <w:bCs/>
+        <w:rPr>
+          <w:rFonts w:ascii="Times New Roman" w:hAnsi="Times New Roman" w:cs="Times New Roman"/>
+          <w:sz w:val="26"/>
+          <w:szCs w:val="26"/>
+        </w:rPr>
+      </w:pPr>
+      <w:r>
+        <w:rPr>
+          <w:rFonts w:ascii="Times New Roman" w:hAnsi="Times New Roman" w:cs="Times New Roman"/>
+          <w:b/>
+          <w:bCs/>
+          <w:noProof/>
           <w:sz w:val="26"/>
           <w:szCs w:val="26"/>
           <w:lang w:val="vi-VN"/>
@@ -2024,29 +2959,392 @@
         <w:jc w:val="center"/>
         <w:rPr>
           <w:rFonts w:ascii="Times New Roman" w:hAnsi="Times New Roman" w:cs="Times New Roman"/>
-          <w:b/>
-          <w:bCs/>
-          <w:sz w:val="26"/>
-          <w:szCs w:val="26"/>
-          <w:lang w:val="vi-VN"/>
-        </w:rPr>
-      </w:pPr>
-      <w:r>
+          <w:color w:val="auto"/>
+          <w:sz w:val="26"/>
+          <w:szCs w:val="26"/>
+          <w:lang w:val="vi-VN"/>
+        </w:rPr>
+      </w:pPr>
+      <w:r>
+        <w:rPr>
+          <w:rFonts w:ascii="Times New Roman" w:hAnsi="Times New Roman" w:cs="Times New Roman"/>
+          <w:color w:val="auto"/>
+          <w:sz w:val="26"/>
+          <w:szCs w:val="26"/>
+        </w:rPr>
         <w:t xml:space="preserve">Hình </w:t>
       </w:r>
-      <w:fldSimple w:instr=" SEQ Hình \* ARABIC ">
-        <w:r>
-          <w:rPr>
-            <w:noProof/>
-          </w:rPr>
-          <w:t>4</w:t>
-        </w:r>
-      </w:fldSimple>
-      <w:r>
-        <w:rPr>
+      <w:r>
+        <w:rPr>
+          <w:rFonts w:ascii="Times New Roman" w:hAnsi="Times New Roman" w:cs="Times New Roman"/>
+          <w:color w:val="auto"/>
+          <w:sz w:val="26"/>
+          <w:szCs w:val="26"/>
+        </w:rPr>
+        <w:fldChar w:fldCharType="begin"/>
+      </w:r>
+      <w:r>
+        <w:rPr>
+          <w:rFonts w:ascii="Times New Roman" w:hAnsi="Times New Roman" w:cs="Times New Roman"/>
+          <w:color w:val="auto"/>
+          <w:sz w:val="26"/>
+          <w:szCs w:val="26"/>
+        </w:rPr>
+        <w:instrText xml:space="preserve"> SEQ Hình \* ARABIC </w:instrText>
+      </w:r>
+      <w:r>
+        <w:rPr>
+          <w:rFonts w:ascii="Times New Roman" w:hAnsi="Times New Roman" w:cs="Times New Roman"/>
+          <w:color w:val="auto"/>
+          <w:sz w:val="26"/>
+          <w:szCs w:val="26"/>
+        </w:rPr>
+        <w:fldChar w:fldCharType="separate"/>
+      </w:r>
+      <w:r>
+        <w:rPr>
+          <w:rFonts w:ascii="Times New Roman" w:hAnsi="Times New Roman" w:cs="Times New Roman"/>
+          <w:noProof/>
+          <w:color w:val="auto"/>
+          <w:sz w:val="26"/>
+          <w:szCs w:val="26"/>
+        </w:rPr>
+        <w:t>4</w:t>
+      </w:r>
+      <w:r>
+        <w:rPr>
+          <w:rFonts w:ascii="Times New Roman" w:hAnsi="Times New Roman" w:cs="Times New Roman"/>
+          <w:noProof/>
+          <w:color w:val="auto"/>
+          <w:sz w:val="26"/>
+          <w:szCs w:val="26"/>
+        </w:rPr>
+        <w:fldChar w:fldCharType="end"/>
+      </w:r>
+      <w:r>
+        <w:rPr>
+          <w:rFonts w:ascii="Times New Roman" w:hAnsi="Times New Roman" w:cs="Times New Roman"/>
+          <w:color w:val="auto"/>
+          <w:sz w:val="26"/>
+          <w:szCs w:val="26"/>
           <w:lang w:val="vi-VN"/>
         </w:rPr>
         <w:t>. Giao diện "Danh mục/Nhà xuất bản"</w:t>
+      </w:r>
+    </w:p>
+    <w:p>
+      <w:pPr>
+        <w:rPr>
+          <w:rFonts w:ascii="Times New Roman" w:hAnsi="Times New Roman" w:cs="Times New Roman"/>
+          <w:sz w:val="26"/>
+          <w:szCs w:val="26"/>
+          <w:lang w:val="vi-VN"/>
+        </w:rPr>
+      </w:pPr>
+    </w:p>
+    <w:p>
+      <w:pPr>
+        <w:keepNext/>
+        <w:jc w:val="center"/>
+        <w:rPr>
+          <w:rFonts w:ascii="Times New Roman" w:hAnsi="Times New Roman" w:cs="Times New Roman"/>
+          <w:sz w:val="26"/>
+          <w:szCs w:val="26"/>
+          <w:lang w:val="vi-VN"/>
+        </w:rPr>
+      </w:pPr>
+    </w:p>
+    <w:p>
+      <w:pPr>
+        <w:keepNext/>
+        <w:jc w:val="center"/>
+        <w:rPr>
+          <w:rFonts w:ascii="Times New Roman" w:hAnsi="Times New Roman" w:cs="Times New Roman"/>
+          <w:sz w:val="26"/>
+          <w:szCs w:val="26"/>
+          <w:lang w:val="vi-VN"/>
+        </w:rPr>
+      </w:pPr>
+    </w:p>
+    <w:p>
+      <w:pPr>
+        <w:keepNext/>
+        <w:jc w:val="center"/>
+        <w:rPr>
+          <w:rFonts w:ascii="Times New Roman" w:hAnsi="Times New Roman" w:cs="Times New Roman"/>
+          <w:sz w:val="26"/>
+          <w:szCs w:val="26"/>
+        </w:rPr>
+      </w:pPr>
+      <w:r>
+        <w:rPr>
+          <w:rFonts w:ascii="Times New Roman" w:hAnsi="Times New Roman" w:cs="Times New Roman"/>
+          <w:sz w:val="26"/>
+          <w:szCs w:val="26"/>
+          <w:lang w:val="vi-VN"/>
+        </w:rPr>
+        <w:drawing>
+          <wp:inline distT="0" distB="0" distL="0" distR="0" wp14:anchorId="70D2C798" wp14:editId="24BFD00C">
+            <wp:extent cx="6471920" cy="3924935"/>
+            <wp:effectExtent l="0" t="0" r="5080" b="0"/>
+            <wp:docPr id="1642025335" name="Picture 1"/>
+            <wp:cNvGraphicFramePr>
+              <a:graphicFrameLocks xmlns:a="http://schemas.openxmlformats.org/drawingml/2006/main" noChangeAspect="1"/>
+            </wp:cNvGraphicFramePr>
+            <a:graphic xmlns:a="http://schemas.openxmlformats.org/drawingml/2006/main">
+              <a:graphicData uri="http://schemas.openxmlformats.org/drawingml/2006/picture">
+                <pic:pic xmlns:pic="http://schemas.openxmlformats.org/drawingml/2006/picture">
+                  <pic:nvPicPr>
+                    <pic:cNvPr id="1642025335" name=""/>
+                    <pic:cNvPicPr/>
+                  </pic:nvPicPr>
+                  <pic:blipFill>
+                    <a:blip r:embed="rId21"/>
+                    <a:stretch>
+                      <a:fillRect/>
+                    </a:stretch>
+                  </pic:blipFill>
+                  <pic:spPr>
+                    <a:xfrm>
+                      <a:off x="0" y="0"/>
+                      <a:ext cx="6471920" cy="3924935"/>
+                    </a:xfrm>
+                    <a:prstGeom prst="rect">
+                      <a:avLst/>
+                    </a:prstGeom>
+                  </pic:spPr>
+                </pic:pic>
+              </a:graphicData>
+            </a:graphic>
+          </wp:inline>
+        </w:drawing>
+      </w:r>
+    </w:p>
+    <w:p>
+      <w:pPr>
+        <w:pStyle w:val="Caption"/>
+        <w:jc w:val="center"/>
+        <w:rPr>
+          <w:rFonts w:ascii="Times New Roman" w:hAnsi="Times New Roman" w:cs="Times New Roman"/>
+          <w:color w:val="auto"/>
+          <w:sz w:val="26"/>
+          <w:szCs w:val="26"/>
+          <w:lang w:val="vi-VN"/>
+        </w:rPr>
+      </w:pPr>
+      <w:r>
+        <w:rPr>
+          <w:rFonts w:ascii="Times New Roman" w:hAnsi="Times New Roman" w:cs="Times New Roman"/>
+          <w:color w:val="auto"/>
+          <w:sz w:val="26"/>
+          <w:szCs w:val="26"/>
+        </w:rPr>
+        <w:t xml:space="preserve">Hình </w:t>
+      </w:r>
+      <w:r>
+        <w:rPr>
+          <w:rFonts w:ascii="Times New Roman" w:hAnsi="Times New Roman" w:cs="Times New Roman"/>
+          <w:color w:val="auto"/>
+          <w:sz w:val="26"/>
+          <w:szCs w:val="26"/>
+        </w:rPr>
+        <w:fldChar w:fldCharType="begin"/>
+      </w:r>
+      <w:r>
+        <w:rPr>
+          <w:rFonts w:ascii="Times New Roman" w:hAnsi="Times New Roman" w:cs="Times New Roman"/>
+          <w:color w:val="auto"/>
+          <w:sz w:val="26"/>
+          <w:szCs w:val="26"/>
+        </w:rPr>
+        <w:instrText xml:space="preserve"> SEQ Hình \* ARABIC </w:instrText>
+      </w:r>
+      <w:r>
+        <w:rPr>
+          <w:rFonts w:ascii="Times New Roman" w:hAnsi="Times New Roman" w:cs="Times New Roman"/>
+          <w:color w:val="auto"/>
+          <w:sz w:val="26"/>
+          <w:szCs w:val="26"/>
+        </w:rPr>
+        <w:fldChar w:fldCharType="separate"/>
+      </w:r>
+      <w:r>
+        <w:rPr>
+          <w:rFonts w:ascii="Times New Roman" w:hAnsi="Times New Roman" w:cs="Times New Roman"/>
+          <w:noProof/>
+          <w:color w:val="auto"/>
+          <w:sz w:val="26"/>
+          <w:szCs w:val="26"/>
+        </w:rPr>
+        <w:t>5</w:t>
+      </w:r>
+      <w:r>
+        <w:rPr>
+          <w:rFonts w:ascii="Times New Roman" w:hAnsi="Times New Roman" w:cs="Times New Roman"/>
+          <w:color w:val="auto"/>
+          <w:sz w:val="26"/>
+          <w:szCs w:val="26"/>
+        </w:rPr>
+        <w:fldChar w:fldCharType="end"/>
+      </w:r>
+      <w:r>
+        <w:rPr>
+          <w:rFonts w:ascii="Times New Roman" w:hAnsi="Times New Roman" w:cs="Times New Roman"/>
+          <w:color w:val="auto"/>
+          <w:sz w:val="26"/>
+          <w:szCs w:val="26"/>
+          <w:lang w:val="vi-VN"/>
+        </w:rPr>
+        <w:t>. Giao diện quản lý đầu sách</w:t>
+      </w:r>
+    </w:p>
+    <w:p>
+      <w:pPr>
+        <w:rPr>
+          <w:lang w:val="vi-VN"/>
+        </w:rPr>
+      </w:pPr>
+    </w:p>
+    <w:p>
+      <w:pPr>
+        <w:jc w:val="center"/>
+        <w:rPr>
+          <w:rFonts w:ascii="Times New Roman" w:hAnsi="Times New Roman" w:cs="Times New Roman"/>
+          <w:sz w:val="26"/>
+          <w:szCs w:val="26"/>
+          <w:lang w:val="vi-VN"/>
+        </w:rPr>
+      </w:pPr>
+    </w:p>
+    <w:p>
+      <w:pPr>
+        <w:keepNext/>
+        <w:jc w:val="center"/>
+        <w:rPr>
+          <w:rFonts w:ascii="Times New Roman" w:hAnsi="Times New Roman" w:cs="Times New Roman"/>
+          <w:sz w:val="26"/>
+          <w:szCs w:val="26"/>
+        </w:rPr>
+      </w:pPr>
+      <w:r>
+        <w:rPr>
+          <w:rFonts w:ascii="Times New Roman" w:hAnsi="Times New Roman" w:cs="Times New Roman"/>
+          <w:sz w:val="26"/>
+          <w:szCs w:val="26"/>
+          <w:lang w:val="vi-VN"/>
+        </w:rPr>
+        <w:drawing>
+          <wp:inline distT="0" distB="0" distL="0" distR="0" wp14:anchorId="5A1812EB" wp14:editId="3A2F9BE2">
+            <wp:extent cx="6471920" cy="2955290"/>
+            <wp:effectExtent l="0" t="0" r="5080" b="0"/>
+            <wp:docPr id="955129972" name="Picture 1"/>
+            <wp:cNvGraphicFramePr>
+              <a:graphicFrameLocks xmlns:a="http://schemas.openxmlformats.org/drawingml/2006/main" noChangeAspect="1"/>
+            </wp:cNvGraphicFramePr>
+            <a:graphic xmlns:a="http://schemas.openxmlformats.org/drawingml/2006/main">
+              <a:graphicData uri="http://schemas.openxmlformats.org/drawingml/2006/picture">
+                <pic:pic xmlns:pic="http://schemas.openxmlformats.org/drawingml/2006/picture">
+                  <pic:nvPicPr>
+                    <pic:cNvPr id="955129972" name=""/>
+                    <pic:cNvPicPr/>
+                  </pic:nvPicPr>
+                  <pic:blipFill>
+                    <a:blip r:embed="rId22"/>
+                    <a:stretch>
+                      <a:fillRect/>
+                    </a:stretch>
+                  </pic:blipFill>
+                  <pic:spPr>
+                    <a:xfrm>
+                      <a:off x="0" y="0"/>
+                      <a:ext cx="6471920" cy="2955290"/>
+                    </a:xfrm>
+                    <a:prstGeom prst="rect">
+                      <a:avLst/>
+                    </a:prstGeom>
+                  </pic:spPr>
+                </pic:pic>
+              </a:graphicData>
+            </a:graphic>
+          </wp:inline>
+        </w:drawing>
+      </w:r>
+    </w:p>
+    <w:p>
+      <w:pPr>
+        <w:pStyle w:val="Caption"/>
+        <w:jc w:val="center"/>
+        <w:rPr>
+          <w:rFonts w:ascii="Times New Roman" w:hAnsi="Times New Roman" w:cs="Times New Roman"/>
+          <w:color w:val="auto"/>
+          <w:sz w:val="26"/>
+          <w:szCs w:val="26"/>
+        </w:rPr>
+      </w:pPr>
+      <w:r>
+        <w:rPr>
+          <w:rFonts w:ascii="Times New Roman" w:hAnsi="Times New Roman" w:cs="Times New Roman"/>
+          <w:color w:val="auto"/>
+          <w:sz w:val="26"/>
+          <w:szCs w:val="26"/>
+        </w:rPr>
+        <w:t xml:space="preserve">Hình </w:t>
+      </w:r>
+      <w:r>
+        <w:rPr>
+          <w:rFonts w:ascii="Times New Roman" w:hAnsi="Times New Roman" w:cs="Times New Roman"/>
+          <w:color w:val="auto"/>
+          <w:sz w:val="26"/>
+          <w:szCs w:val="26"/>
+        </w:rPr>
+        <w:fldChar w:fldCharType="begin"/>
+      </w:r>
+      <w:r>
+        <w:rPr>
+          <w:rFonts w:ascii="Times New Roman" w:hAnsi="Times New Roman" w:cs="Times New Roman"/>
+          <w:color w:val="auto"/>
+          <w:sz w:val="26"/>
+          <w:szCs w:val="26"/>
+        </w:rPr>
+        <w:instrText xml:space="preserve"> SEQ Hình \* ARABIC </w:instrText>
+      </w:r>
+      <w:r>
+        <w:rPr>
+          <w:rFonts w:ascii="Times New Roman" w:hAnsi="Times New Roman" w:cs="Times New Roman"/>
+          <w:color w:val="auto"/>
+          <w:sz w:val="26"/>
+          <w:szCs w:val="26"/>
+        </w:rPr>
+        <w:fldChar w:fldCharType="separate"/>
+      </w:r>
+      <w:r>
+        <w:rPr>
+          <w:rFonts w:ascii="Times New Roman" w:hAnsi="Times New Roman" w:cs="Times New Roman"/>
+          <w:noProof/>
+          <w:color w:val="auto"/>
+          <w:sz w:val="26"/>
+          <w:szCs w:val="26"/>
+        </w:rPr>
+        <w:t>6</w:t>
+      </w:r>
+      <w:r>
+        <w:rPr>
+          <w:rFonts w:ascii="Times New Roman" w:hAnsi="Times New Roman" w:cs="Times New Roman"/>
+          <w:color w:val="auto"/>
+          <w:sz w:val="26"/>
+          <w:szCs w:val="26"/>
+        </w:rPr>
+        <w:fldChar w:fldCharType="end"/>
+      </w:r>
+      <w:r>
+        <w:rPr>
+          <w:rFonts w:ascii="Times New Roman" w:hAnsi="Times New Roman" w:cs="Times New Roman"/>
+          <w:color w:val="auto"/>
+          <w:sz w:val="26"/>
+          <w:szCs w:val="26"/>
+          <w:lang w:val="vi-VN"/>
+        </w:rPr>
+        <w:t>. Giao diện độc giả và thẻ thư viện</w:t>
       </w:r>
     </w:p>
     <w:sectPr>

</xml_diff>